<commit_message>
Rebuild corrected Charte ambassadeurs IA 2026 with clickable data portal link
Co-Authored-By: Claude Opus 5.5 <noreply@anthropic.com>
Claude-Session: https://claude.ai/code/session_01L29EpsLwZYsS9hbtNCx5Zi
</commit_message>
<xml_diff>
--- a/Charte-ambassadeurs-IA_2026_dpia_corrigee.docx
+++ b/Charte-ambassadeurs-IA_2026_dpia_corrigee.docx
@@ -3105,7 +3105,27 @@
           <w:sz w:val="20"/>
           <w:szCs w:val="20"/>
         </w:rPr>
-        <w:t>Les données nécessaires peuvent être partagées avec les DREETS et les référents sectoriels. Les informations professionnelles (nom, structure, coordonnées professionnelles dont l’adresse électronique, domaines d’expertise, territoire, secteur, site web et réseaux sociaux professionnels) sont publiées et rediffusées sous forme de données ouvertes sur le portail data.economie.gouv.fr, à l’adresse suivante : https://data.economie.gouv.fr/explore/assets/ambassadeursia/.</w:t>
+        <w:t xml:space="preserve">Les données nécessaires peuvent être partagées avec les DREETS et les référents sectoriels. Les informations professionnelles (nom, structure, coordonnées professionnelles dont l’adresse électronique, domaines d’expertise, territoire, secteur, site web et réseaux sociaux professionnels) sont publiées et rediffusées sous forme de données ouvertes sur le portail data.economie.gouv.fr, à l’adresse suivante : </w:t>
+      </w:r>
+      <w:hyperlink r:id="rIdAmbData1" w:history="1">
+        <w:r>
+          <w:rPr>
+            <w:color w:val="0563C1"/>
+            <w:u w:val="single"/>
+            <w:rFonts w:ascii="Marianne" w:eastAsia="Marianne" w:hAnsi="Marianne" w:cs="Marianne"/>
+            <w:sz w:val="20"/>
+            <w:szCs w:val="20"/>
+          </w:rPr>
+          <w:t>https://data.economie.gouv.fr/explore/assets/ambassadeursia/</w:t>
+        </w:r>
+      </w:hyperlink>
+      <w:r>
+        <w:rPr>
+          <w:rFonts w:ascii="Marianne" w:eastAsia="Marianne" w:hAnsi="Marianne" w:cs="Marianne"/>
+          <w:sz w:val="20"/>
+          <w:szCs w:val="20"/>
+        </w:rPr>
+        <w:t>.</w:t>
       </w:r>
     </w:p>
     <w:p>
@@ -3124,7 +3144,7 @@
           <w:sz w:val="20"/>
           <w:szCs w:val="20"/>
         </w:rPr>
-        <w:t>Le titre d’Ambassadeur IA ayant un caractère public, l’adresse électronique indiquée par l’Ambassadeur est accessible à tous sur ce portail. Elle pourra donc être utilisée par toute personne souhaitant le contacter, notamment les entreprises, la DGE, les DREETS, les référents et les autres acteurs du réseau, et recevoir des sollicitations de toute nature. L’Ambassadeur est libre de choisir l’adresse indiquée : il est recommandé de créer une adresse électronique dédiée à cette mission, distincte de ses adresses personnelles. En acceptant la présente charte, l’Ambassadeur reconnaît avoir été informé de cette publication.</w:t>
+        <w:t>Le titre d’Ambassadeur IA ayant un caractère public, l’adresse électronique indiquée par l’Ambassadeur est accessible à tous sur ce portail. Elle pourra donc être utilisée par toute personne souhaitant le contacter, notamment les entreprises, la DGE, les DREETS, les référents et les autres acteurs du réseau, et recevoir des sollicitations de toute nature. L’Ambassadeur est libre de choisir l’adresse indiquée : il est recommandé de créer une adresse électronique dédiée à cette mission, distincte de ses adresses personnelles. En acceptant la présente charte, l’Ambassadeur reconnaît avoir été informé de cette publication.</w:t>
       </w:r>
     </w:p>
     <w:p>

</xml_diff>